<commit_message>
Refine report reading section with paper figures
</commit_message>
<xml_diff>
--- a/report/reproduction_report_academic_revised.docx
+++ b/report/reproduction_report_academic_revised.docx
@@ -9,7 +9,7 @@
       </w:pPr>
       <w:r>
         <w:rPr>
-          <w:rFonts w:ascii="Times New Roman" w:hAnsi="Times New Roman" w:eastAsia="SimHei"/>
+          <w:rFonts w:ascii="Times New Roman" w:hAnsi="Times New Roman" w:eastAsia="SimSun"/>
           <w:b/>
           <w:i w:val="0"/>
           <w:color w:val="000000"/>
@@ -27,6 +27,7 @@
         <w:rPr>
           <w:rFonts w:ascii="Times New Roman" w:hAnsi="Times New Roman" w:eastAsia="SimSun"/>
           <w:b w:val="0"/>
+          <w:i w:val="0"/>
           <w:color w:val="000000"/>
           <w:sz w:val="22"/>
         </w:rPr>
@@ -177,7 +178,7 @@
       </w:r>
       <w:r>
         <w:rPr>
-          <w:rFonts w:ascii="Consolas" w:hAnsi="Consolas" w:eastAsia="SimSun"/>
+          <w:rFonts w:ascii="Times New Roman" w:hAnsi="Times New Roman" w:eastAsia="SimSun"/>
           <w:b w:val="0"/>
           <w:i w:val="0"/>
           <w:color w:val="000000"/>
@@ -197,7 +198,7 @@
       </w:r>
       <w:r>
         <w:rPr>
-          <w:rFonts w:ascii="Consolas" w:hAnsi="Consolas" w:eastAsia="SimSun"/>
+          <w:rFonts w:ascii="Times New Roman" w:hAnsi="Times New Roman" w:eastAsia="SimSun"/>
           <w:b w:val="0"/>
           <w:i w:val="0"/>
           <w:color w:val="000000"/>
@@ -233,7 +234,7 @@
       </w:r>
       <w:r>
         <w:rPr>
-          <w:rFonts w:ascii="Consolas" w:hAnsi="Consolas" w:eastAsia="SimSun"/>
+          <w:rFonts w:ascii="Times New Roman" w:hAnsi="Times New Roman" w:eastAsia="SimSun"/>
           <w:b w:val="0"/>
           <w:i w:val="0"/>
           <w:color w:val="000000"/>
@@ -396,6 +397,78 @@
     </w:p>
     <w:p>
       <w:pPr>
+        <w:spacing w:before="100" w:after="40"/>
+        <w:jc w:val="center"/>
+      </w:pPr>
+      <w:r>
+        <w:drawing>
+          <wp:inline xmlns:a="http://schemas.openxmlformats.org/drawingml/2006/main" xmlns:pic="http://schemas.openxmlformats.org/drawingml/2006/picture">
+            <wp:extent cx="4389120" cy="2441947"/>
+            <wp:docPr id="1" name="Picture 1"/>
+            <wp:cNvGraphicFramePr>
+              <a:graphicFrameLocks noChangeAspect="1"/>
+            </wp:cNvGraphicFramePr>
+            <a:graphic>
+              <a:graphicData uri="http://schemas.openxmlformats.org/drawingml/2006/picture">
+                <pic:pic>
+                  <pic:nvPicPr>
+                    <pic:cNvPr id="0" name="image1.png"/>
+                    <pic:cNvPicPr/>
+                  </pic:nvPicPr>
+                  <pic:blipFill>
+                    <a:blip r:embed="rId9"/>
+                    <a:stretch>
+                      <a:fillRect/>
+                    </a:stretch>
+                  </pic:blipFill>
+                  <pic:spPr>
+                    <a:xfrm>
+                      <a:off x="0" y="0"/>
+                      <a:ext cx="4389120" cy="2441947"/>
+                    </a:xfrm>
+                    <a:prstGeom prst="rect"/>
+                  </pic:spPr>
+                </pic:pic>
+              </a:graphicData>
+            </a:graphic>
+          </wp:inline>
+        </w:drawing>
+      </w:r>
+    </w:p>
+    <w:p>
+      <w:pPr>
+        <w:spacing w:after="60"/>
+        <w:jc w:val="center"/>
+      </w:pPr>
+      <w:r>
+        <w:rPr>
+          <w:rFonts w:ascii="Times New Roman" w:hAnsi="Times New Roman" w:eastAsia="SimSun"/>
+          <w:b/>
+          <w:i w:val="0"/>
+          <w:color w:val="000000"/>
+          <w:sz w:val="19"/>
+        </w:rPr>
+        <w:t>图 1  传统无损压缩 pipeline 与 ZipServ 执行时间对比（来源：原论文 Figure 1）。</w:t>
+      </w:r>
+    </w:p>
+    <w:p>
+      <w:pPr>
+        <w:spacing w:after="60"/>
+        <w:ind w:firstLine="420"/>
+      </w:pPr>
+      <w:r>
+        <w:rPr>
+          <w:rFonts w:ascii="Times New Roman" w:hAnsi="Times New Roman" w:eastAsia="SimSun"/>
+          <w:b w:val="0"/>
+          <w:i w:val="0"/>
+          <w:color w:val="000000"/>
+          <w:sz w:val="19"/>
+        </w:rPr>
+        <w:t>该图说明，传统 decoupled pipeline 中单独解压阶段会引入明显开销；ZipServ 的研究动机并非单纯提高压缩率，而是让无损压缩在 GPU 推理路径中真正转化为加速收益。</w:t>
+      </w:r>
+    </w:p>
+    <w:p>
+      <w:pPr>
         <w:pStyle w:val="Heading2"/>
       </w:pPr>
       <w:r>
@@ -469,6 +542,78 @@
           <w:sz w:val="21"/>
         </w:rPr>
         <w:t>ZipGEMM 的关键思想是 load-compressed, compute-decompressed：从显存读取压缩权重，在寄存器中即时恢复 BF16 值，然后直接进入 Tensor Core MMA，避免把完整解压后的权重重新写回 global memory。</w:t>
+      </w:r>
+    </w:p>
+    <w:p>
+      <w:pPr>
+        <w:spacing w:before="100" w:after="40"/>
+        <w:jc w:val="center"/>
+      </w:pPr>
+      <w:r>
+        <w:drawing>
+          <wp:inline xmlns:a="http://schemas.openxmlformats.org/drawingml/2006/main" xmlns:pic="http://schemas.openxmlformats.org/drawingml/2006/picture">
+            <wp:extent cx="5577840" cy="1816041"/>
+            <wp:docPr id="2" name="Picture 2"/>
+            <wp:cNvGraphicFramePr>
+              <a:graphicFrameLocks noChangeAspect="1"/>
+            </wp:cNvGraphicFramePr>
+            <a:graphic>
+              <a:graphicData uri="http://schemas.openxmlformats.org/drawingml/2006/picture">
+                <pic:pic>
+                  <pic:nvPicPr>
+                    <pic:cNvPr id="0" name="image3.png"/>
+                    <pic:cNvPicPr/>
+                  </pic:nvPicPr>
+                  <pic:blipFill>
+                    <a:blip r:embed="rId10"/>
+                    <a:stretch>
+                      <a:fillRect/>
+                    </a:stretch>
+                  </pic:blipFill>
+                  <pic:spPr>
+                    <a:xfrm>
+                      <a:off x="0" y="0"/>
+                      <a:ext cx="5577840" cy="1816041"/>
+                    </a:xfrm>
+                    <a:prstGeom prst="rect"/>
+                  </pic:spPr>
+                </pic:pic>
+              </a:graphicData>
+            </a:graphic>
+          </wp:inline>
+        </w:drawing>
+      </w:r>
+    </w:p>
+    <w:p>
+      <w:pPr>
+        <w:spacing w:after="60"/>
+        <w:jc w:val="center"/>
+      </w:pPr>
+      <w:r>
+        <w:rPr>
+          <w:rFonts w:ascii="Times New Roman" w:hAnsi="Times New Roman" w:eastAsia="SimSun"/>
+          <w:b/>
+          <w:i w:val="0"/>
+          <w:color w:val="000000"/>
+          <w:sz w:val="19"/>
+        </w:rPr>
+        <w:t>图 2  ZipServ 系统整体架构（来源：原论文 Figure 6）。</w:t>
+      </w:r>
+    </w:p>
+    <w:p>
+      <w:pPr>
+        <w:spacing w:after="60"/>
+        <w:ind w:firstLine="420"/>
+      </w:pPr>
+      <w:r>
+        <w:rPr>
+          <w:rFonts w:ascii="Times New Roman" w:hAnsi="Times New Roman" w:eastAsia="SimSun"/>
+          <w:b w:val="0"/>
+          <w:i w:val="0"/>
+          <w:color w:val="000000"/>
+          <w:sz w:val="19"/>
+        </w:rPr>
+        <w:t>左侧为离线权重压缩流程，右侧为在线推理执行流程。ZipServ 将 BF16 权重离线编码为 TCA-TBE 格式，并在 decode 阶段通过 fused kernel 直接读取压缩权重完成计算。</w:t>
       </w:r>
     </w:p>
     <w:p>
@@ -552,6 +697,222 @@
     </w:p>
     <w:p>
       <w:pPr>
+        <w:spacing w:before="100" w:after="40"/>
+        <w:jc w:val="center"/>
+      </w:pPr>
+      <w:r>
+        <w:drawing>
+          <wp:inline xmlns:a="http://schemas.openxmlformats.org/drawingml/2006/main" xmlns:pic="http://schemas.openxmlformats.org/drawingml/2006/picture">
+            <wp:extent cx="4297680" cy="3572770"/>
+            <wp:docPr id="3" name="Picture 3"/>
+            <wp:cNvGraphicFramePr>
+              <a:graphicFrameLocks noChangeAspect="1"/>
+            </wp:cNvGraphicFramePr>
+            <a:graphic>
+              <a:graphicData uri="http://schemas.openxmlformats.org/drawingml/2006/picture">
+                <pic:pic>
+                  <pic:nvPicPr>
+                    <pic:cNvPr id="0" name="image2.png"/>
+                    <pic:cNvPicPr/>
+                  </pic:nvPicPr>
+                  <pic:blipFill>
+                    <a:blip r:embed="rId11"/>
+                    <a:stretch>
+                      <a:fillRect/>
+                    </a:stretch>
+                  </pic:blipFill>
+                  <pic:spPr>
+                    <a:xfrm>
+                      <a:off x="0" y="0"/>
+                      <a:ext cx="4297680" cy="3572770"/>
+                    </a:xfrm>
+                    <a:prstGeom prst="rect"/>
+                  </pic:spPr>
+                </pic:pic>
+              </a:graphicData>
+            </a:graphic>
+          </wp:inline>
+        </w:drawing>
+      </w:r>
+    </w:p>
+    <w:p>
+      <w:pPr>
+        <w:spacing w:after="60"/>
+        <w:jc w:val="center"/>
+      </w:pPr>
+      <w:r>
+        <w:rPr>
+          <w:rFonts w:ascii="Times New Roman" w:hAnsi="Times New Roman" w:eastAsia="SimSun"/>
+          <w:b/>
+          <w:i w:val="0"/>
+          <w:color w:val="000000"/>
+          <w:sz w:val="19"/>
+        </w:rPr>
+        <w:t>图 3  LLM 权重 BF16 exponent 分布特征（来源：原论文 Figure 2）。</w:t>
+      </w:r>
+    </w:p>
+    <w:p>
+      <w:pPr>
+        <w:spacing w:after="60"/>
+        <w:ind w:firstLine="420"/>
+      </w:pPr>
+      <w:r>
+        <w:rPr>
+          <w:rFonts w:ascii="Times New Roman" w:hAnsi="Times New Roman" w:eastAsia="SimSun"/>
+          <w:b w:val="0"/>
+          <w:i w:val="0"/>
+          <w:color w:val="000000"/>
+          <w:sz w:val="19"/>
+        </w:rPr>
+        <w:t>该图佐证了 ZipServ 的关键统计观察：不同模型权重的 exponent 并非均匀分布，而是集中在少数高频值附近，因此可以用 base exponent 与短 offset 表示大多数权重指数位。</w:t>
+      </w:r>
+    </w:p>
+    <w:p>
+      <w:pPr>
+        <w:spacing w:before="100" w:after="40"/>
+        <w:jc w:val="center"/>
+      </w:pPr>
+      <w:r>
+        <w:drawing>
+          <wp:inline xmlns:a="http://schemas.openxmlformats.org/drawingml/2006/main" xmlns:pic="http://schemas.openxmlformats.org/drawingml/2006/picture">
+            <wp:extent cx="4206240" cy="3433298"/>
+            <wp:docPr id="4" name="Picture 4"/>
+            <wp:cNvGraphicFramePr>
+              <a:graphicFrameLocks noChangeAspect="1"/>
+            </wp:cNvGraphicFramePr>
+            <a:graphic>
+              <a:graphicData uri="http://schemas.openxmlformats.org/drawingml/2006/picture">
+                <pic:pic>
+                  <pic:nvPicPr>
+                    <pic:cNvPr id="0" name="image4.png"/>
+                    <pic:cNvPicPr/>
+                  </pic:nvPicPr>
+                  <pic:blipFill>
+                    <a:blip r:embed="rId12"/>
+                    <a:stretch>
+                      <a:fillRect/>
+                    </a:stretch>
+                  </pic:blipFill>
+                  <pic:spPr>
+                    <a:xfrm>
+                      <a:off x="0" y="0"/>
+                      <a:ext cx="4206240" cy="3433298"/>
+                    </a:xfrm>
+                    <a:prstGeom prst="rect"/>
+                  </pic:spPr>
+                </pic:pic>
+              </a:graphicData>
+            </a:graphic>
+          </wp:inline>
+        </w:drawing>
+      </w:r>
+    </w:p>
+    <w:p>
+      <w:pPr>
+        <w:spacing w:after="60"/>
+        <w:jc w:val="center"/>
+      </w:pPr>
+      <w:r>
+        <w:rPr>
+          <w:rFonts w:ascii="Times New Roman" w:hAnsi="Times New Roman" w:eastAsia="SimSun"/>
+          <w:b/>
+          <w:i w:val="0"/>
+          <w:color w:val="000000"/>
+          <w:sz w:val="19"/>
+        </w:rPr>
+        <w:t>图 4  Tensor-Core-Aware Triple Bitmap Encoding（来源：原论文 Figure 7）。</w:t>
+      </w:r>
+    </w:p>
+    <w:p>
+      <w:pPr>
+        <w:spacing w:after="60"/>
+        <w:ind w:firstLine="420"/>
+      </w:pPr>
+      <w:r>
+        <w:rPr>
+          <w:rFonts w:ascii="Times New Roman" w:hAnsi="Times New Roman" w:eastAsia="SimSun"/>
+          <w:b w:val="0"/>
+          <w:i w:val="0"/>
+          <w:color w:val="000000"/>
+          <w:sz w:val="19"/>
+        </w:rPr>
+        <w:t>TCA-TBE 将高频 exponent 表示为 3-bit offset，并把 offset 的三个 bit 平面拆成三张 bitmap。该格式牺牲少量极限压缩率，换取固定长度、少分支、适合 GPU SIMT 并行解码的访问模式。</w:t>
+      </w:r>
+    </w:p>
+    <w:p>
+      <w:pPr>
+        <w:spacing w:before="100" w:after="40"/>
+        <w:jc w:val="center"/>
+      </w:pPr>
+      <w:r>
+        <w:drawing>
+          <wp:inline xmlns:a="http://schemas.openxmlformats.org/drawingml/2006/main" xmlns:pic="http://schemas.openxmlformats.org/drawingml/2006/picture">
+            <wp:extent cx="4389120" cy="2740029"/>
+            <wp:docPr id="5" name="Picture 5"/>
+            <wp:cNvGraphicFramePr>
+              <a:graphicFrameLocks noChangeAspect="1"/>
+            </wp:cNvGraphicFramePr>
+            <a:graphic>
+              <a:graphicData uri="http://schemas.openxmlformats.org/drawingml/2006/picture">
+                <pic:pic>
+                  <pic:nvPicPr>
+                    <pic:cNvPr id="0" name="image5.png"/>
+                    <pic:cNvPicPr/>
+                  </pic:nvPicPr>
+                  <pic:blipFill>
+                    <a:blip r:embed="rId13"/>
+                    <a:stretch>
+                      <a:fillRect/>
+                    </a:stretch>
+                  </pic:blipFill>
+                  <pic:spPr>
+                    <a:xfrm>
+                      <a:off x="0" y="0"/>
+                      <a:ext cx="4389120" cy="2740029"/>
+                    </a:xfrm>
+                    <a:prstGeom prst="rect"/>
+                  </pic:spPr>
+                </pic:pic>
+              </a:graphicData>
+            </a:graphic>
+          </wp:inline>
+        </w:drawing>
+      </w:r>
+    </w:p>
+    <w:p>
+      <w:pPr>
+        <w:spacing w:after="60"/>
+        <w:jc w:val="center"/>
+      </w:pPr>
+      <w:r>
+        <w:rPr>
+          <w:rFonts w:ascii="Times New Roman" w:hAnsi="Times New Roman" w:eastAsia="SimSun"/>
+          <w:b/>
+          <w:i w:val="0"/>
+          <w:color w:val="000000"/>
+          <w:sz w:val="19"/>
+        </w:rPr>
+        <w:t>图 5  ZipGEMM 数据移动与指令流水（来源：原论文 Figure 8）。</w:t>
+      </w:r>
+    </w:p>
+    <w:p>
+      <w:pPr>
+        <w:spacing w:after="60"/>
+        <w:ind w:firstLine="420"/>
+      </w:pPr>
+      <w:r>
+        <w:rPr>
+          <w:rFonts w:ascii="Times New Roman" w:hAnsi="Times New Roman" w:eastAsia="SimSun"/>
+          <w:b w:val="0"/>
+          <w:i w:val="0"/>
+          <w:color w:val="000000"/>
+          <w:sz w:val="19"/>
+        </w:rPr>
+        <w:t>ZipGEMM 的核心是 load-compressed, compute-decompressed：压缩权重从 global memory 读入后，在 shared memory/register 中即时恢复，并直接送入 Tensor Core，减少解压后权重回写 global memory 的中间开销。</w:t>
+      </w:r>
+    </w:p>
+    <w:p>
+      <w:pPr>
         <w:pStyle w:val="Heading2"/>
       </w:pPr>
       <w:r>
@@ -1840,7 +2201,7 @@
       </w:pPr>
       <w:r>
         <w:rPr>
-          <w:rFonts w:ascii="Consolas" w:hAnsi="Consolas" w:eastAsia="SimSun"/>
+          <w:rFonts w:ascii="Times New Roman" w:hAnsi="Times New Roman" w:eastAsia="SimSun"/>
           <w:b w:val="0"/>
           <w:i w:val="0"/>
           <w:color w:val="000000"/>
@@ -1872,7 +2233,7 @@
       </w:pPr>
       <w:r>
         <w:rPr>
-          <w:rFonts w:ascii="Consolas" w:hAnsi="Consolas" w:eastAsia="SimSun"/>
+          <w:rFonts w:ascii="Times New Roman" w:hAnsi="Times New Roman" w:eastAsia="SimSun"/>
           <w:b w:val="0"/>
           <w:i w:val="0"/>
           <w:color w:val="000000"/>
@@ -1904,7 +2265,7 @@
       </w:pPr>
       <w:r>
         <w:rPr>
-          <w:rFonts w:ascii="Consolas" w:hAnsi="Consolas" w:eastAsia="SimSun"/>
+          <w:rFonts w:ascii="Times New Roman" w:hAnsi="Times New Roman" w:eastAsia="SimSun"/>
           <w:b w:val="0"/>
           <w:i w:val="0"/>
           <w:color w:val="000000"/>
@@ -2863,7 +3224,7 @@
       </w:pPr>
       <w:r>
         <w:rPr>
-          <w:rFonts w:ascii="Consolas" w:hAnsi="Consolas" w:eastAsia="SimSun"/>
+          <w:rFonts w:ascii="Times New Roman" w:hAnsi="Times New Roman" w:eastAsia="SimSun"/>
           <w:b w:val="0"/>
           <w:i w:val="0"/>
           <w:color w:val="000000"/>
@@ -2879,7 +3240,7 @@
       </w:pPr>
       <w:r>
         <w:rPr>
-          <w:rFonts w:ascii="Consolas" w:hAnsi="Consolas" w:eastAsia="SimSun"/>
+          <w:rFonts w:ascii="Times New Roman" w:hAnsi="Times New Roman" w:eastAsia="SimSun"/>
           <w:b w:val="0"/>
           <w:i w:val="0"/>
           <w:color w:val="000000"/>
@@ -2895,7 +3256,7 @@
       </w:pPr>
       <w:r>
         <w:rPr>
-          <w:rFonts w:ascii="Consolas" w:hAnsi="Consolas" w:eastAsia="SimSun"/>
+          <w:rFonts w:ascii="Times New Roman" w:hAnsi="Times New Roman" w:eastAsia="SimSun"/>
           <w:b w:val="0"/>
           <w:i w:val="0"/>
           <w:color w:val="000000"/>
@@ -2942,7 +3303,7 @@
       </w:pPr>
       <w:r>
         <w:rPr>
-          <w:rFonts w:ascii="Consolas" w:hAnsi="Consolas" w:eastAsia="SimSun"/>
+          <w:rFonts w:ascii="Times New Roman" w:hAnsi="Times New Roman" w:eastAsia="SimSun"/>
           <w:b w:val="0"/>
           <w:i w:val="0"/>
           <w:color w:val="000000"/>
@@ -2974,7 +3335,7 @@
       </w:pPr>
       <w:r>
         <w:rPr>
-          <w:rFonts w:ascii="Consolas" w:hAnsi="Consolas" w:eastAsia="SimSun"/>
+          <w:rFonts w:ascii="Times New Roman" w:hAnsi="Times New Roman" w:eastAsia="SimSun"/>
           <w:b w:val="0"/>
           <w:i w:val="0"/>
           <w:color w:val="000000"/>
@@ -3006,7 +3367,7 @@
       </w:pPr>
       <w:r>
         <w:rPr>
-          <w:rFonts w:ascii="Consolas" w:hAnsi="Consolas" w:eastAsia="SimSun"/>
+          <w:rFonts w:ascii="Times New Roman" w:hAnsi="Times New Roman" w:eastAsia="SimSun"/>
           <w:b w:val="0"/>
           <w:i w:val="0"/>
           <w:color w:val="000000"/>
@@ -3022,7 +3383,7 @@
       </w:pPr>
       <w:r>
         <w:rPr>
-          <w:rFonts w:ascii="Consolas" w:hAnsi="Consolas" w:eastAsia="SimSun"/>
+          <w:rFonts w:ascii="Times New Roman" w:hAnsi="Times New Roman" w:eastAsia="SimSun"/>
           <w:b w:val="0"/>
           <w:i w:val="0"/>
           <w:color w:val="000000"/>
@@ -3054,7 +3415,7 @@
       </w:pPr>
       <w:r>
         <w:rPr>
-          <w:rFonts w:ascii="Consolas" w:hAnsi="Consolas" w:eastAsia="SimSun"/>
+          <w:rFonts w:ascii="Times New Roman" w:hAnsi="Times New Roman" w:eastAsia="SimSun"/>
           <w:b w:val="0"/>
           <w:i w:val="0"/>
           <w:color w:val="000000"/>
@@ -3070,1123 +3431,13 @@
       </w:pPr>
       <w:r>
         <w:rPr>
-          <w:rFonts w:ascii="Consolas" w:hAnsi="Consolas" w:eastAsia="SimSun"/>
+          <w:rFonts w:ascii="Times New Roman" w:hAnsi="Times New Roman" w:eastAsia="SimSun"/>
           <w:b w:val="0"/>
           <w:i w:val="0"/>
           <w:color w:val="000000"/>
           <w:sz w:val="18"/>
         </w:rPr>
         <w:t>python scripts/parse_and_plot_shape_sweep.py</w:t>
-      </w:r>
-    </w:p>
-    <w:p>
-      <w:pPr>
-        <w:pStyle w:val="Heading2"/>
-      </w:pPr>
-      <w:r>
-        <w:rPr>
-          <w:rFonts w:ascii="Times New Roman" w:hAnsi="Times New Roman" w:eastAsia="SimHei"/>
-          <w:b/>
-          <w:i w:val="0"/>
-          <w:color w:val="000000"/>
-          <w:sz w:val="26"/>
-        </w:rPr>
-        <w:t>3.3 踩坑记录</w:t>
-      </w:r>
-    </w:p>
-    <w:tbl>
-      <w:tblPr>
-        <w:tblW w:type="auto" w:w="0"/>
-        <w:jc w:val="center"/>
-        <w:tblLayout w:type="autofit"/>
-        <w:tblLook w:firstColumn="1" w:firstRow="1" w:lastColumn="0" w:lastRow="0" w:noHBand="0" w:noVBand="1" w:val="04A0"/>
-      </w:tblPr>
-      <w:tblGrid>
-        <w:gridCol w:w="2266"/>
-        <w:gridCol w:w="2266"/>
-        <w:gridCol w:w="2266"/>
-        <w:gridCol w:w="2266"/>
-      </w:tblGrid>
-      <w:tr>
-        <w:tc>
-          <w:tcPr>
-            <w:tcW w:type="dxa" w:w="2266"/>
-            <w:vAlign w:val="center"/>
-            <w:tcMar>
-              <w:top w:w="60" w:type="dxa"/>
-              <w:start w:w="90" w:type="dxa"/>
-              <w:bottom w:w="60" w:type="dxa"/>
-              <w:end w:w="90" w:type="dxa"/>
-            </w:tcMar>
-            <w:tcBorders>
-              <w:top w:val="single" w:sz="12" w:space="0" w:color="000000"/>
-              <w:left w:val="nil" w:sz="0" w:space="0" w:color="FFFFFF"/>
-              <w:bottom w:val="single" w:sz="8" w:space="0" w:color="000000"/>
-              <w:right w:val="nil" w:sz="0" w:space="0" w:color="FFFFFF"/>
-            </w:tcBorders>
-          </w:tcPr>
-          <w:p>
-            <w:pPr>
-              <w:spacing w:after="0" w:before="0"/>
-              <w:jc w:val="center"/>
-            </w:pPr>
-            <w:r>
-              <w:rPr>
-                <w:rFonts w:ascii="Times New Roman" w:hAnsi="Times New Roman" w:eastAsia="SimSun"/>
-                <w:b/>
-                <w:i w:val="0"/>
-                <w:color w:val="000000"/>
-                <w:sz w:val="17"/>
-              </w:rPr>
-            </w:r>
-            <w:r>
-              <w:rPr>
-                <w:rFonts w:ascii="Times New Roman" w:hAnsi="Times New Roman" w:eastAsia="SimSun"/>
-                <w:b/>
-                <w:i w:val="0"/>
-                <w:color w:val="000000"/>
-                <w:sz w:val="17"/>
-              </w:rPr>
-              <w:t>问题</w:t>
-            </w:r>
-          </w:p>
-        </w:tc>
-        <w:tc>
-          <w:tcPr>
-            <w:tcW w:type="dxa" w:w="2266"/>
-            <w:vAlign w:val="center"/>
-            <w:tcMar>
-              <w:top w:w="60" w:type="dxa"/>
-              <w:start w:w="90" w:type="dxa"/>
-              <w:bottom w:w="60" w:type="dxa"/>
-              <w:end w:w="90" w:type="dxa"/>
-            </w:tcMar>
-            <w:tcBorders>
-              <w:top w:val="single" w:sz="12" w:space="0" w:color="000000"/>
-              <w:left w:val="nil" w:sz="0" w:space="0" w:color="FFFFFF"/>
-              <w:bottom w:val="single" w:sz="8" w:space="0" w:color="000000"/>
-              <w:right w:val="nil" w:sz="0" w:space="0" w:color="FFFFFF"/>
-            </w:tcBorders>
-          </w:tcPr>
-          <w:p>
-            <w:pPr>
-              <w:spacing w:after="0" w:before="0"/>
-              <w:jc w:val="center"/>
-            </w:pPr>
-            <w:r>
-              <w:rPr>
-                <w:rFonts w:ascii="Times New Roman" w:hAnsi="Times New Roman" w:eastAsia="SimSun"/>
-                <w:b/>
-                <w:i w:val="0"/>
-                <w:color w:val="000000"/>
-                <w:sz w:val="17"/>
-              </w:rPr>
-            </w:r>
-            <w:r>
-              <w:rPr>
-                <w:rFonts w:ascii="Times New Roman" w:hAnsi="Times New Roman" w:eastAsia="SimSun"/>
-                <w:b/>
-                <w:i w:val="0"/>
-                <w:color w:val="000000"/>
-                <w:sz w:val="17"/>
-              </w:rPr>
-              <w:t>现象</w:t>
-            </w:r>
-          </w:p>
-        </w:tc>
-        <w:tc>
-          <w:tcPr>
-            <w:tcW w:type="dxa" w:w="2266"/>
-            <w:vAlign w:val="center"/>
-            <w:tcMar>
-              <w:top w:w="60" w:type="dxa"/>
-              <w:start w:w="90" w:type="dxa"/>
-              <w:bottom w:w="60" w:type="dxa"/>
-              <w:end w:w="90" w:type="dxa"/>
-            </w:tcMar>
-            <w:tcBorders>
-              <w:top w:val="single" w:sz="12" w:space="0" w:color="000000"/>
-              <w:left w:val="nil" w:sz="0" w:space="0" w:color="FFFFFF"/>
-              <w:bottom w:val="single" w:sz="8" w:space="0" w:color="000000"/>
-              <w:right w:val="nil" w:sz="0" w:space="0" w:color="FFFFFF"/>
-            </w:tcBorders>
-          </w:tcPr>
-          <w:p>
-            <w:pPr>
-              <w:spacing w:after="0" w:before="0"/>
-              <w:jc w:val="center"/>
-            </w:pPr>
-            <w:r>
-              <w:rPr>
-                <w:rFonts w:ascii="Times New Roman" w:hAnsi="Times New Roman" w:eastAsia="SimSun"/>
-                <w:b/>
-                <w:i w:val="0"/>
-                <w:color w:val="000000"/>
-                <w:sz w:val="17"/>
-              </w:rPr>
-            </w:r>
-            <w:r>
-              <w:rPr>
-                <w:rFonts w:ascii="Times New Roman" w:hAnsi="Times New Roman" w:eastAsia="SimSun"/>
-                <w:b/>
-                <w:i w:val="0"/>
-                <w:color w:val="000000"/>
-                <w:sz w:val="17"/>
-              </w:rPr>
-              <w:t>原因</w:t>
-            </w:r>
-          </w:p>
-        </w:tc>
-        <w:tc>
-          <w:tcPr>
-            <w:tcW w:type="dxa" w:w="2266"/>
-            <w:vAlign w:val="center"/>
-            <w:tcMar>
-              <w:top w:w="60" w:type="dxa"/>
-              <w:start w:w="90" w:type="dxa"/>
-              <w:bottom w:w="60" w:type="dxa"/>
-              <w:end w:w="90" w:type="dxa"/>
-            </w:tcMar>
-            <w:tcBorders>
-              <w:top w:val="single" w:sz="12" w:space="0" w:color="000000"/>
-              <w:left w:val="nil" w:sz="0" w:space="0" w:color="FFFFFF"/>
-              <w:bottom w:val="single" w:sz="8" w:space="0" w:color="000000"/>
-              <w:right w:val="nil" w:sz="0" w:space="0" w:color="FFFFFF"/>
-            </w:tcBorders>
-          </w:tcPr>
-          <w:p>
-            <w:pPr>
-              <w:spacing w:after="0" w:before="0"/>
-              <w:jc w:val="center"/>
-            </w:pPr>
-            <w:r>
-              <w:rPr>
-                <w:rFonts w:ascii="Times New Roman" w:hAnsi="Times New Roman" w:eastAsia="SimSun"/>
-                <w:b/>
-                <w:i w:val="0"/>
-                <w:color w:val="000000"/>
-                <w:sz w:val="17"/>
-              </w:rPr>
-            </w:r>
-            <w:r>
-              <w:rPr>
-                <w:rFonts w:ascii="Times New Roman" w:hAnsi="Times New Roman" w:eastAsia="SimSun"/>
-                <w:b/>
-                <w:i w:val="0"/>
-                <w:color w:val="000000"/>
-                <w:sz w:val="17"/>
-              </w:rPr>
-              <w:t>解决方案</w:t>
-            </w:r>
-          </w:p>
-        </w:tc>
-      </w:tr>
-      <w:tr>
-        <w:tc>
-          <w:tcPr>
-            <w:tcW w:type="dxa" w:w="2266"/>
-            <w:vAlign w:val="center"/>
-            <w:tcMar>
-              <w:top w:w="60" w:type="dxa"/>
-              <w:start w:w="90" w:type="dxa"/>
-              <w:bottom w:w="60" w:type="dxa"/>
-              <w:end w:w="90" w:type="dxa"/>
-            </w:tcMar>
-            <w:tcBorders>
-              <w:top w:val="nil" w:sz="0" w:space="0" w:color="FFFFFF"/>
-              <w:left w:val="nil" w:sz="0" w:space="0" w:color="FFFFFF"/>
-              <w:bottom w:val="nil" w:sz="0" w:space="0" w:color="FFFFFF"/>
-              <w:right w:val="nil" w:sz="0" w:space="0" w:color="FFFFFF"/>
-            </w:tcBorders>
-          </w:tcPr>
-          <w:p>
-            <w:pPr>
-              <w:spacing w:after="0" w:before="0"/>
-              <w:jc w:val="left"/>
-            </w:pPr>
-            <w:r>
-              <w:rPr>
-                <w:rFonts w:ascii="Times New Roman" w:hAnsi="Times New Roman" w:eastAsia="SimSun"/>
-                <w:b w:val="0"/>
-                <w:i w:val="0"/>
-                <w:color w:val="000000"/>
-                <w:sz w:val="17"/>
-              </w:rPr>
-            </w:r>
-            <w:r>
-              <w:rPr>
-                <w:rFonts w:ascii="Times New Roman" w:hAnsi="Times New Roman" w:eastAsia="SimSun"/>
-                <w:b w:val="0"/>
-                <w:i w:val="0"/>
-                <w:color w:val="000000"/>
-                <w:sz w:val="17"/>
-              </w:rPr>
-              <w:t>GitHub HTTPS 克隆失败</w:t>
-            </w:r>
-          </w:p>
-        </w:tc>
-        <w:tc>
-          <w:tcPr>
-            <w:tcW w:type="dxa" w:w="2266"/>
-            <w:vAlign w:val="center"/>
-            <w:tcMar>
-              <w:top w:w="60" w:type="dxa"/>
-              <w:start w:w="90" w:type="dxa"/>
-              <w:bottom w:w="60" w:type="dxa"/>
-              <w:end w:w="90" w:type="dxa"/>
-            </w:tcMar>
-            <w:tcBorders>
-              <w:top w:val="nil" w:sz="0" w:space="0" w:color="FFFFFF"/>
-              <w:left w:val="nil" w:sz="0" w:space="0" w:color="FFFFFF"/>
-              <w:bottom w:val="nil" w:sz="0" w:space="0" w:color="FFFFFF"/>
-              <w:right w:val="nil" w:sz="0" w:space="0" w:color="FFFFFF"/>
-            </w:tcBorders>
-          </w:tcPr>
-          <w:p>
-            <w:pPr>
-              <w:spacing w:after="0" w:before="0"/>
-              <w:jc w:val="center"/>
-            </w:pPr>
-            <w:r>
-              <w:rPr>
-                <w:rFonts w:ascii="Times New Roman" w:hAnsi="Times New Roman" w:eastAsia="SimSun"/>
-                <w:b w:val="0"/>
-                <w:i w:val="0"/>
-                <w:color w:val="000000"/>
-                <w:sz w:val="17"/>
-              </w:rPr>
-            </w:r>
-            <w:r>
-              <w:rPr>
-                <w:rFonts w:ascii="Times New Roman" w:hAnsi="Times New Roman" w:eastAsia="SimSun"/>
-                <w:b w:val="0"/>
-                <w:i w:val="0"/>
-                <w:color w:val="000000"/>
-                <w:sz w:val="17"/>
-              </w:rPr>
-              <w:t>Failed to connect to github.com port 443</w:t>
-            </w:r>
-          </w:p>
-        </w:tc>
-        <w:tc>
-          <w:tcPr>
-            <w:tcW w:type="dxa" w:w="2266"/>
-            <w:vAlign w:val="center"/>
-            <w:tcMar>
-              <w:top w:w="60" w:type="dxa"/>
-              <w:start w:w="90" w:type="dxa"/>
-              <w:bottom w:w="60" w:type="dxa"/>
-              <w:end w:w="90" w:type="dxa"/>
-            </w:tcMar>
-            <w:tcBorders>
-              <w:top w:val="nil" w:sz="0" w:space="0" w:color="FFFFFF"/>
-              <w:left w:val="nil" w:sz="0" w:space="0" w:color="FFFFFF"/>
-              <w:bottom w:val="nil" w:sz="0" w:space="0" w:color="FFFFFF"/>
-              <w:right w:val="nil" w:sz="0" w:space="0" w:color="FFFFFF"/>
-            </w:tcBorders>
-          </w:tcPr>
-          <w:p>
-            <w:pPr>
-              <w:spacing w:after="0" w:before="0"/>
-              <w:jc w:val="center"/>
-            </w:pPr>
-            <w:r>
-              <w:rPr>
-                <w:rFonts w:ascii="Times New Roman" w:hAnsi="Times New Roman" w:eastAsia="SimSun"/>
-                <w:b w:val="0"/>
-                <w:i w:val="0"/>
-                <w:color w:val="000000"/>
-                <w:sz w:val="17"/>
-              </w:rPr>
-            </w:r>
-            <w:r>
-              <w:rPr>
-                <w:rFonts w:ascii="Times New Roman" w:hAnsi="Times New Roman" w:eastAsia="SimSun"/>
-                <w:b w:val="0"/>
-                <w:i w:val="0"/>
-                <w:color w:val="000000"/>
-                <w:sz w:val="17"/>
-              </w:rPr>
-              <w:t>服务器访问 GitHub HTTPS 不稳定</w:t>
-            </w:r>
-          </w:p>
-        </w:tc>
-        <w:tc>
-          <w:tcPr>
-            <w:tcW w:type="dxa" w:w="2266"/>
-            <w:vAlign w:val="center"/>
-            <w:tcMar>
-              <w:top w:w="60" w:type="dxa"/>
-              <w:start w:w="90" w:type="dxa"/>
-              <w:bottom w:w="60" w:type="dxa"/>
-              <w:end w:w="90" w:type="dxa"/>
-            </w:tcMar>
-            <w:tcBorders>
-              <w:top w:val="nil" w:sz="0" w:space="0" w:color="FFFFFF"/>
-              <w:left w:val="nil" w:sz="0" w:space="0" w:color="FFFFFF"/>
-              <w:bottom w:val="nil" w:sz="0" w:space="0" w:color="FFFFFF"/>
-              <w:right w:val="nil" w:sz="0" w:space="0" w:color="FFFFFF"/>
-            </w:tcBorders>
-          </w:tcPr>
-          <w:p>
-            <w:pPr>
-              <w:spacing w:after="0" w:before="0"/>
-              <w:jc w:val="center"/>
-            </w:pPr>
-            <w:r>
-              <w:rPr>
-                <w:rFonts w:ascii="Times New Roman" w:hAnsi="Times New Roman" w:eastAsia="SimSun"/>
-                <w:b w:val="0"/>
-                <w:i w:val="0"/>
-                <w:color w:val="000000"/>
-                <w:sz w:val="17"/>
-              </w:rPr>
-            </w:r>
-            <w:r>
-              <w:rPr>
-                <w:rFonts w:ascii="Times New Roman" w:hAnsi="Times New Roman" w:eastAsia="SimSun"/>
-                <w:b w:val="0"/>
-                <w:i w:val="0"/>
-                <w:color w:val="000000"/>
-                <w:sz w:val="17"/>
-              </w:rPr>
-              <w:t>改用 GitHub SSH，并配置 SSH key</w:t>
-            </w:r>
-          </w:p>
-        </w:tc>
-      </w:tr>
-      <w:tr>
-        <w:tc>
-          <w:tcPr>
-            <w:tcW w:type="dxa" w:w="2266"/>
-            <w:vAlign w:val="center"/>
-            <w:tcMar>
-              <w:top w:w="60" w:type="dxa"/>
-              <w:start w:w="90" w:type="dxa"/>
-              <w:bottom w:w="60" w:type="dxa"/>
-              <w:end w:w="90" w:type="dxa"/>
-            </w:tcMar>
-            <w:tcBorders>
-              <w:top w:val="nil" w:sz="0" w:space="0" w:color="FFFFFF"/>
-              <w:left w:val="nil" w:sz="0" w:space="0" w:color="FFFFFF"/>
-              <w:bottom w:val="nil" w:sz="0" w:space="0" w:color="FFFFFF"/>
-              <w:right w:val="nil" w:sz="0" w:space="0" w:color="FFFFFF"/>
-            </w:tcBorders>
-          </w:tcPr>
-          <w:p>
-            <w:pPr>
-              <w:spacing w:after="0" w:before="0"/>
-              <w:jc w:val="left"/>
-            </w:pPr>
-            <w:r>
-              <w:rPr>
-                <w:rFonts w:ascii="Times New Roman" w:hAnsi="Times New Roman" w:eastAsia="SimSun"/>
-                <w:b w:val="0"/>
-                <w:i w:val="0"/>
-                <w:color w:val="000000"/>
-                <w:sz w:val="17"/>
-              </w:rPr>
-            </w:r>
-            <w:r>
-              <w:rPr>
-                <w:rFonts w:ascii="Times New Roman" w:hAnsi="Times New Roman" w:eastAsia="SimSun"/>
-                <w:b w:val="0"/>
-                <w:i w:val="0"/>
-                <w:color w:val="000000"/>
-                <w:sz w:val="17"/>
-              </w:rPr>
-              <w:t>CUDA 路径不匹配</w:t>
-            </w:r>
-          </w:p>
-        </w:tc>
-        <w:tc>
-          <w:tcPr>
-            <w:tcW w:type="dxa" w:w="2266"/>
-            <w:vAlign w:val="center"/>
-            <w:tcMar>
-              <w:top w:w="60" w:type="dxa"/>
-              <w:start w:w="90" w:type="dxa"/>
-              <w:bottom w:w="60" w:type="dxa"/>
-              <w:end w:w="90" w:type="dxa"/>
-            </w:tcMar>
-            <w:tcBorders>
-              <w:top w:val="nil" w:sz="0" w:space="0" w:color="FFFFFF"/>
-              <w:left w:val="nil" w:sz="0" w:space="0" w:color="FFFFFF"/>
-              <w:bottom w:val="nil" w:sz="0" w:space="0" w:color="FFFFFF"/>
-              <w:right w:val="nil" w:sz="0" w:space="0" w:color="FFFFFF"/>
-            </w:tcBorders>
-          </w:tcPr>
-          <w:p>
-            <w:pPr>
-              <w:spacing w:after="0" w:before="0"/>
-              <w:jc w:val="center"/>
-            </w:pPr>
-            <w:r>
-              <w:rPr>
-                <w:rFonts w:ascii="Times New Roman" w:hAnsi="Times New Roman" w:eastAsia="SimSun"/>
-                <w:b w:val="0"/>
-                <w:i w:val="0"/>
-                <w:color w:val="000000"/>
-                <w:sz w:val="17"/>
-              </w:rPr>
-            </w:r>
-            <w:r>
-              <w:rPr>
-                <w:rFonts w:ascii="Times New Roman" w:hAnsi="Times New Roman" w:eastAsia="SimSun"/>
-                <w:b w:val="0"/>
-                <w:i w:val="0"/>
-                <w:color w:val="000000"/>
-                <w:sz w:val="17"/>
-              </w:rPr>
-              <w:t>make: /usr/local/cuda/bin/nvcc: No such file or directory</w:t>
-            </w:r>
-          </w:p>
-        </w:tc>
-        <w:tc>
-          <w:tcPr>
-            <w:tcW w:type="dxa" w:w="2266"/>
-            <w:vAlign w:val="center"/>
-            <w:tcMar>
-              <w:top w:w="60" w:type="dxa"/>
-              <w:start w:w="90" w:type="dxa"/>
-              <w:bottom w:w="60" w:type="dxa"/>
-              <w:end w:w="90" w:type="dxa"/>
-            </w:tcMar>
-            <w:tcBorders>
-              <w:top w:val="nil" w:sz="0" w:space="0" w:color="FFFFFF"/>
-              <w:left w:val="nil" w:sz="0" w:space="0" w:color="FFFFFF"/>
-              <w:bottom w:val="nil" w:sz="0" w:space="0" w:color="FFFFFF"/>
-              <w:right w:val="nil" w:sz="0" w:space="0" w:color="FFFFFF"/>
-            </w:tcBorders>
-          </w:tcPr>
-          <w:p>
-            <w:pPr>
-              <w:spacing w:after="0" w:before="0"/>
-              <w:jc w:val="center"/>
-            </w:pPr>
-            <w:r>
-              <w:rPr>
-                <w:rFonts w:ascii="Times New Roman" w:hAnsi="Times New Roman" w:eastAsia="SimSun"/>
-                <w:b w:val="0"/>
-                <w:i w:val="0"/>
-                <w:color w:val="000000"/>
-                <w:sz w:val="17"/>
-              </w:rPr>
-            </w:r>
-            <w:r>
-              <w:rPr>
-                <w:rFonts w:ascii="Times New Roman" w:hAnsi="Times New Roman" w:eastAsia="SimSun"/>
-                <w:b w:val="0"/>
-                <w:i w:val="0"/>
-                <w:color w:val="000000"/>
-                <w:sz w:val="17"/>
-              </w:rPr>
-              <w:t>官方 Makefile 默认寻找 /usr/local/cuda，服务器实际为 /usr/bin/nvcc</w:t>
-            </w:r>
-          </w:p>
-        </w:tc>
-        <w:tc>
-          <w:tcPr>
-            <w:tcW w:type="dxa" w:w="2266"/>
-            <w:vAlign w:val="center"/>
-            <w:tcMar>
-              <w:top w:w="60" w:type="dxa"/>
-              <w:start w:w="90" w:type="dxa"/>
-              <w:bottom w:w="60" w:type="dxa"/>
-              <w:end w:w="90" w:type="dxa"/>
-            </w:tcMar>
-            <w:tcBorders>
-              <w:top w:val="nil" w:sz="0" w:space="0" w:color="FFFFFF"/>
-              <w:left w:val="nil" w:sz="0" w:space="0" w:color="FFFFFF"/>
-              <w:bottom w:val="nil" w:sz="0" w:space="0" w:color="FFFFFF"/>
-              <w:right w:val="nil" w:sz="0" w:space="0" w:color="FFFFFF"/>
-            </w:tcBorders>
-          </w:tcPr>
-          <w:p>
-            <w:pPr>
-              <w:spacing w:after="0" w:before="0"/>
-              <w:jc w:val="center"/>
-            </w:pPr>
-            <w:r>
-              <w:rPr>
-                <w:rFonts w:ascii="Times New Roman" w:hAnsi="Times New Roman" w:eastAsia="SimSun"/>
-                <w:b w:val="0"/>
-                <w:i w:val="0"/>
-                <w:color w:val="000000"/>
-                <w:sz w:val="17"/>
-              </w:rPr>
-            </w:r>
-            <w:r>
-              <w:rPr>
-                <w:rFonts w:ascii="Times New Roman" w:hAnsi="Times New Roman" w:eastAsia="SimSun"/>
-                <w:b w:val="0"/>
-                <w:i w:val="0"/>
-                <w:color w:val="000000"/>
-                <w:sz w:val="17"/>
-              </w:rPr>
-              <w:t>编译时显式传入 CUDA_INSTALL_PATH=/usr CUDA_HOME=/usr</w:t>
-            </w:r>
-          </w:p>
-        </w:tc>
-      </w:tr>
-      <w:tr>
-        <w:tc>
-          <w:tcPr>
-            <w:tcW w:type="dxa" w:w="2266"/>
-            <w:vAlign w:val="center"/>
-            <w:tcMar>
-              <w:top w:w="60" w:type="dxa"/>
-              <w:start w:w="90" w:type="dxa"/>
-              <w:bottom w:w="60" w:type="dxa"/>
-              <w:end w:w="90" w:type="dxa"/>
-            </w:tcMar>
-            <w:tcBorders>
-              <w:top w:val="nil" w:sz="0" w:space="0" w:color="FFFFFF"/>
-              <w:left w:val="nil" w:sz="0" w:space="0" w:color="FFFFFF"/>
-              <w:bottom w:val="nil" w:sz="0" w:space="0" w:color="FFFFFF"/>
-              <w:right w:val="nil" w:sz="0" w:space="0" w:color="FFFFFF"/>
-            </w:tcBorders>
-          </w:tcPr>
-          <w:p>
-            <w:pPr>
-              <w:spacing w:after="0" w:before="0"/>
-              <w:jc w:val="left"/>
-            </w:pPr>
-            <w:r>
-              <w:rPr>
-                <w:rFonts w:ascii="Times New Roman" w:hAnsi="Times New Roman" w:eastAsia="SimSun"/>
-                <w:b w:val="0"/>
-                <w:i w:val="0"/>
-                <w:color w:val="000000"/>
-                <w:sz w:val="17"/>
-              </w:rPr>
-            </w:r>
-            <w:r>
-              <w:rPr>
-                <w:rFonts w:ascii="Times New Roman" w:hAnsi="Times New Roman" w:eastAsia="SimSun"/>
-                <w:b w:val="0"/>
-                <w:i w:val="0"/>
-                <w:color w:val="000000"/>
-                <w:sz w:val="17"/>
-              </w:rPr>
-              <w:t>CUDA BF16 host/device 编译错误</w:t>
-            </w:r>
-          </w:p>
-        </w:tc>
-        <w:tc>
-          <w:tcPr>
-            <w:tcW w:type="dxa" w:w="2266"/>
-            <w:vAlign w:val="center"/>
-            <w:tcMar>
-              <w:top w:w="60" w:type="dxa"/>
-              <w:start w:w="90" w:type="dxa"/>
-              <w:bottom w:w="60" w:type="dxa"/>
-              <w:end w:w="90" w:type="dxa"/>
-            </w:tcMar>
-            <w:tcBorders>
-              <w:top w:val="nil" w:sz="0" w:space="0" w:color="FFFFFF"/>
-              <w:left w:val="nil" w:sz="0" w:space="0" w:color="FFFFFF"/>
-              <w:bottom w:val="nil" w:sz="0" w:space="0" w:color="FFFFFF"/>
-              <w:right w:val="nil" w:sz="0" w:space="0" w:color="FFFFFF"/>
-            </w:tcBorders>
-          </w:tcPr>
-          <w:p>
-            <w:pPr>
-              <w:spacing w:after="0" w:before="0"/>
-              <w:jc w:val="center"/>
-            </w:pPr>
-            <w:r>
-              <w:rPr>
-                <w:rFonts w:ascii="Times New Roman" w:hAnsi="Times New Roman" w:eastAsia="SimSun"/>
-                <w:b w:val="0"/>
-                <w:i w:val="0"/>
-                <w:color w:val="000000"/>
-                <w:sz w:val="17"/>
-              </w:rPr>
-            </w:r>
-            <w:r>
-              <w:rPr>
-                <w:rFonts w:ascii="Times New Roman" w:hAnsi="Times New Roman" w:eastAsia="SimSun"/>
-                <w:b w:val="0"/>
-                <w:i w:val="0"/>
-                <w:color w:val="000000"/>
-                <w:sz w:val="17"/>
-              </w:rPr>
-              <w:t>host 函数调用 __device__ BF16 转换函数报错</w:t>
-            </w:r>
-          </w:p>
-        </w:tc>
-        <w:tc>
-          <w:tcPr>
-            <w:tcW w:type="dxa" w:w="2266"/>
-            <w:vAlign w:val="center"/>
-            <w:tcMar>
-              <w:top w:w="60" w:type="dxa"/>
-              <w:start w:w="90" w:type="dxa"/>
-              <w:bottom w:w="60" w:type="dxa"/>
-              <w:end w:w="90" w:type="dxa"/>
-            </w:tcMar>
-            <w:tcBorders>
-              <w:top w:val="nil" w:sz="0" w:space="0" w:color="FFFFFF"/>
-              <w:left w:val="nil" w:sz="0" w:space="0" w:color="FFFFFF"/>
-              <w:bottom w:val="nil" w:sz="0" w:space="0" w:color="FFFFFF"/>
-              <w:right w:val="nil" w:sz="0" w:space="0" w:color="FFFFFF"/>
-            </w:tcBorders>
-          </w:tcPr>
-          <w:p>
-            <w:pPr>
-              <w:spacing w:after="0" w:before="0"/>
-              <w:jc w:val="center"/>
-            </w:pPr>
-            <w:r>
-              <w:rPr>
-                <w:rFonts w:ascii="Times New Roman" w:hAnsi="Times New Roman" w:eastAsia="SimSun"/>
-                <w:b w:val="0"/>
-                <w:i w:val="0"/>
-                <w:color w:val="000000"/>
-                <w:sz w:val="17"/>
-              </w:rPr>
-            </w:r>
-            <w:r>
-              <w:rPr>
-                <w:rFonts w:ascii="Times New Roman" w:hAnsi="Times New Roman" w:eastAsia="SimSun"/>
-                <w:b w:val="0"/>
-                <w:i w:val="0"/>
-                <w:color w:val="000000"/>
-                <w:sz w:val="17"/>
-              </w:rPr>
-              <w:t>CUDA 12.0 下部分 BF16 intrinsic 只能在 device 端调用</w:t>
-            </w:r>
-          </w:p>
-        </w:tc>
-        <w:tc>
-          <w:tcPr>
-            <w:tcW w:type="dxa" w:w="2266"/>
-            <w:vAlign w:val="center"/>
-            <w:tcMar>
-              <w:top w:w="60" w:type="dxa"/>
-              <w:start w:w="90" w:type="dxa"/>
-              <w:bottom w:w="60" w:type="dxa"/>
-              <w:end w:w="90" w:type="dxa"/>
-            </w:tcMar>
-            <w:tcBorders>
-              <w:top w:val="nil" w:sz="0" w:space="0" w:color="FFFFFF"/>
-              <w:left w:val="nil" w:sz="0" w:space="0" w:color="FFFFFF"/>
-              <w:bottom w:val="nil" w:sz="0" w:space="0" w:color="FFFFFF"/>
-              <w:right w:val="nil" w:sz="0" w:space="0" w:color="FFFFFF"/>
-            </w:tcBorders>
-          </w:tcPr>
-          <w:p>
-            <w:pPr>
-              <w:spacing w:after="0" w:before="0"/>
-              <w:jc w:val="center"/>
-            </w:pPr>
-            <w:r>
-              <w:rPr>
-                <w:rFonts w:ascii="Times New Roman" w:hAnsi="Times New Roman" w:eastAsia="SimSun"/>
-                <w:b w:val="0"/>
-                <w:i w:val="0"/>
-                <w:color w:val="000000"/>
-                <w:sz w:val="17"/>
-              </w:rPr>
-            </w:r>
-            <w:r>
-              <w:rPr>
-                <w:rFonts w:ascii="Times New Roman" w:hAnsi="Times New Roman" w:eastAsia="SimSun"/>
-                <w:b w:val="0"/>
-                <w:i w:val="0"/>
-                <w:color w:val="000000"/>
-                <w:sz w:val="17"/>
-              </w:rPr>
-              <w:t>添加 host 端 std::memcpy bit 转换函数并替换 host 调用</w:t>
-            </w:r>
-          </w:p>
-        </w:tc>
-      </w:tr>
-      <w:tr>
-        <w:tc>
-          <w:tcPr>
-            <w:tcW w:type="dxa" w:w="2266"/>
-            <w:vAlign w:val="center"/>
-            <w:tcMar>
-              <w:top w:w="60" w:type="dxa"/>
-              <w:start w:w="90" w:type="dxa"/>
-              <w:bottom w:w="60" w:type="dxa"/>
-              <w:end w:w="90" w:type="dxa"/>
-            </w:tcMar>
-            <w:tcBorders>
-              <w:top w:val="nil" w:sz="0" w:space="0" w:color="FFFFFF"/>
-              <w:left w:val="nil" w:sz="0" w:space="0" w:color="FFFFFF"/>
-              <w:bottom w:val="nil" w:sz="0" w:space="0" w:color="FFFFFF"/>
-              <w:right w:val="nil" w:sz="0" w:space="0" w:color="FFFFFF"/>
-            </w:tcBorders>
-          </w:tcPr>
-          <w:p>
-            <w:pPr>
-              <w:spacing w:after="0" w:before="0"/>
-              <w:jc w:val="left"/>
-            </w:pPr>
-            <w:r>
-              <w:rPr>
-                <w:rFonts w:ascii="Times New Roman" w:hAnsi="Times New Roman" w:eastAsia="SimSun"/>
-                <w:b w:val="0"/>
-                <w:i w:val="0"/>
-                <w:color w:val="000000"/>
-                <w:sz w:val="17"/>
-              </w:rPr>
-            </w:r>
-            <w:r>
-              <w:rPr>
-                <w:rFonts w:ascii="Times New Roman" w:hAnsi="Times New Roman" w:eastAsia="SimSun"/>
-                <w:b w:val="0"/>
-                <w:i w:val="0"/>
-                <w:color w:val="000000"/>
-                <w:sz w:val="17"/>
-              </w:rPr>
-              <w:t>benchmark 编译 warning</w:t>
-            </w:r>
-          </w:p>
-        </w:tc>
-        <w:tc>
-          <w:tcPr>
-            <w:tcW w:type="dxa" w:w="2266"/>
-            <w:vAlign w:val="center"/>
-            <w:tcMar>
-              <w:top w:w="60" w:type="dxa"/>
-              <w:start w:w="90" w:type="dxa"/>
-              <w:bottom w:w="60" w:type="dxa"/>
-              <w:end w:w="90" w:type="dxa"/>
-            </w:tcMar>
-            <w:tcBorders>
-              <w:top w:val="nil" w:sz="0" w:space="0" w:color="FFFFFF"/>
-              <w:left w:val="nil" w:sz="0" w:space="0" w:color="FFFFFF"/>
-              <w:bottom w:val="nil" w:sz="0" w:space="0" w:color="FFFFFF"/>
-              <w:right w:val="nil" w:sz="0" w:space="0" w:color="FFFFFF"/>
-            </w:tcBorders>
-          </w:tcPr>
-          <w:p>
-            <w:pPr>
-              <w:spacing w:after="0" w:before="0"/>
-              <w:jc w:val="center"/>
-            </w:pPr>
-            <w:r>
-              <w:rPr>
-                <w:rFonts w:ascii="Times New Roman" w:hAnsi="Times New Roman" w:eastAsia="SimSun"/>
-                <w:b w:val="0"/>
-                <w:i w:val="0"/>
-                <w:color w:val="000000"/>
-                <w:sz w:val="17"/>
-              </w:rPr>
-            </w:r>
-            <w:r>
-              <w:rPr>
-                <w:rFonts w:ascii="Times New Roman" w:hAnsi="Times New Roman" w:eastAsia="SimSun"/>
-                <w:b w:val="0"/>
-                <w:i w:val="0"/>
-                <w:color w:val="000000"/>
-                <w:sz w:val="17"/>
-              </w:rPr>
-              <w:t>printf 格式与 uint64_t 不匹配</w:t>
-            </w:r>
-          </w:p>
-        </w:tc>
-        <w:tc>
-          <w:tcPr>
-            <w:tcW w:type="dxa" w:w="2266"/>
-            <w:vAlign w:val="center"/>
-            <w:tcMar>
-              <w:top w:w="60" w:type="dxa"/>
-              <w:start w:w="90" w:type="dxa"/>
-              <w:bottom w:w="60" w:type="dxa"/>
-              <w:end w:w="90" w:type="dxa"/>
-            </w:tcMar>
-            <w:tcBorders>
-              <w:top w:val="nil" w:sz="0" w:space="0" w:color="FFFFFF"/>
-              <w:left w:val="nil" w:sz="0" w:space="0" w:color="FFFFFF"/>
-              <w:bottom w:val="nil" w:sz="0" w:space="0" w:color="FFFFFF"/>
-              <w:right w:val="nil" w:sz="0" w:space="0" w:color="FFFFFF"/>
-            </w:tcBorders>
-          </w:tcPr>
-          <w:p>
-            <w:pPr>
-              <w:spacing w:after="0" w:before="0"/>
-              <w:jc w:val="center"/>
-            </w:pPr>
-            <w:r>
-              <w:rPr>
-                <w:rFonts w:ascii="Times New Roman" w:hAnsi="Times New Roman" w:eastAsia="SimSun"/>
-                <w:b w:val="0"/>
-                <w:i w:val="0"/>
-                <w:color w:val="000000"/>
-                <w:sz w:val="17"/>
-              </w:rPr>
-            </w:r>
-            <w:r>
-              <w:rPr>
-                <w:rFonts w:ascii="Times New Roman" w:hAnsi="Times New Roman" w:eastAsia="SimSun"/>
-                <w:b w:val="0"/>
-                <w:i w:val="0"/>
-                <w:color w:val="000000"/>
-                <w:sz w:val="17"/>
-              </w:rPr>
-              <w:t>调试输出格式问题</w:t>
-            </w:r>
-          </w:p>
-        </w:tc>
-        <w:tc>
-          <w:tcPr>
-            <w:tcW w:type="dxa" w:w="2266"/>
-            <w:vAlign w:val="center"/>
-            <w:tcMar>
-              <w:top w:w="60" w:type="dxa"/>
-              <w:start w:w="90" w:type="dxa"/>
-              <w:bottom w:w="60" w:type="dxa"/>
-              <w:end w:w="90" w:type="dxa"/>
-            </w:tcMar>
-            <w:tcBorders>
-              <w:top w:val="nil" w:sz="0" w:space="0" w:color="FFFFFF"/>
-              <w:left w:val="nil" w:sz="0" w:space="0" w:color="FFFFFF"/>
-              <w:bottom w:val="nil" w:sz="0" w:space="0" w:color="FFFFFF"/>
-              <w:right w:val="nil" w:sz="0" w:space="0" w:color="FFFFFF"/>
-            </w:tcBorders>
-          </w:tcPr>
-          <w:p>
-            <w:pPr>
-              <w:spacing w:after="0" w:before="0"/>
-              <w:jc w:val="center"/>
-            </w:pPr>
-            <w:r>
-              <w:rPr>
-                <w:rFonts w:ascii="Times New Roman" w:hAnsi="Times New Roman" w:eastAsia="SimSun"/>
-                <w:b w:val="0"/>
-                <w:i w:val="0"/>
-                <w:color w:val="000000"/>
-                <w:sz w:val="17"/>
-              </w:rPr>
-            </w:r>
-            <w:r>
-              <w:rPr>
-                <w:rFonts w:ascii="Times New Roman" w:hAnsi="Times New Roman" w:eastAsia="SimSun"/>
-                <w:b w:val="0"/>
-                <w:i w:val="0"/>
-                <w:color w:val="000000"/>
-                <w:sz w:val="17"/>
-              </w:rPr>
-              <w:t>不影响 benchmark 正确编译和运行，暂未修改</w:t>
-            </w:r>
-          </w:p>
-        </w:tc>
-      </w:tr>
-      <w:tr>
-        <w:tc>
-          <w:tcPr>
-            <w:tcW w:type="dxa" w:w="2266"/>
-            <w:vAlign w:val="center"/>
-            <w:tcMar>
-              <w:top w:w="60" w:type="dxa"/>
-              <w:start w:w="90" w:type="dxa"/>
-              <w:bottom w:w="60" w:type="dxa"/>
-              <w:end w:w="90" w:type="dxa"/>
-            </w:tcMar>
-            <w:tcBorders>
-              <w:top w:val="nil" w:sz="0" w:space="0" w:color="FFFFFF"/>
-              <w:left w:val="nil" w:sz="0" w:space="0" w:color="FFFFFF"/>
-              <w:bottom w:val="single" w:sz="12" w:space="0" w:color="000000"/>
-              <w:right w:val="nil" w:sz="0" w:space="0" w:color="FFFFFF"/>
-            </w:tcBorders>
-          </w:tcPr>
-          <w:p>
-            <w:pPr>
-              <w:spacing w:after="0" w:before="0"/>
-              <w:jc w:val="left"/>
-            </w:pPr>
-            <w:r>
-              <w:rPr>
-                <w:rFonts w:ascii="Times New Roman" w:hAnsi="Times New Roman" w:eastAsia="SimSun"/>
-                <w:b w:val="0"/>
-                <w:i w:val="0"/>
-                <w:color w:val="000000"/>
-                <w:sz w:val="17"/>
-              </w:rPr>
-            </w:r>
-            <w:r>
-              <w:rPr>
-                <w:rFonts w:ascii="Times New Roman" w:hAnsi="Times New Roman" w:eastAsia="SimSun"/>
-                <w:b w:val="0"/>
-                <w:i w:val="0"/>
-                <w:color w:val="000000"/>
-                <w:sz w:val="17"/>
-              </w:rPr>
-              <w:t>conda 初次使用 ToS 问题</w:t>
-            </w:r>
-          </w:p>
-        </w:tc>
-        <w:tc>
-          <w:tcPr>
-            <w:tcW w:type="dxa" w:w="2266"/>
-            <w:vAlign w:val="center"/>
-            <w:tcMar>
-              <w:top w:w="60" w:type="dxa"/>
-              <w:start w:w="90" w:type="dxa"/>
-              <w:bottom w:w="60" w:type="dxa"/>
-              <w:end w:w="90" w:type="dxa"/>
-            </w:tcMar>
-            <w:tcBorders>
-              <w:top w:val="nil" w:sz="0" w:space="0" w:color="FFFFFF"/>
-              <w:left w:val="nil" w:sz="0" w:space="0" w:color="FFFFFF"/>
-              <w:bottom w:val="single" w:sz="12" w:space="0" w:color="000000"/>
-              <w:right w:val="nil" w:sz="0" w:space="0" w:color="FFFFFF"/>
-            </w:tcBorders>
-          </w:tcPr>
-          <w:p>
-            <w:pPr>
-              <w:spacing w:after="0" w:before="0"/>
-              <w:jc w:val="center"/>
-            </w:pPr>
-            <w:r>
-              <w:rPr>
-                <w:rFonts w:ascii="Times New Roman" w:hAnsi="Times New Roman" w:eastAsia="SimSun"/>
-                <w:b w:val="0"/>
-                <w:i w:val="0"/>
-                <w:color w:val="000000"/>
-                <w:sz w:val="17"/>
-              </w:rPr>
-            </w:r>
-            <w:r>
-              <w:rPr>
-                <w:rFonts w:ascii="Times New Roman" w:hAnsi="Times New Roman" w:eastAsia="SimSun"/>
-                <w:b w:val="0"/>
-                <w:i w:val="0"/>
-                <w:color w:val="000000"/>
-                <w:sz w:val="17"/>
-              </w:rPr>
-              <w:t>Terms of Service have not been accepted</w:t>
-            </w:r>
-          </w:p>
-        </w:tc>
-        <w:tc>
-          <w:tcPr>
-            <w:tcW w:type="dxa" w:w="2266"/>
-            <w:vAlign w:val="center"/>
-            <w:tcMar>
-              <w:top w:w="60" w:type="dxa"/>
-              <w:start w:w="90" w:type="dxa"/>
-              <w:bottom w:w="60" w:type="dxa"/>
-              <w:end w:w="90" w:type="dxa"/>
-            </w:tcMar>
-            <w:tcBorders>
-              <w:top w:val="nil" w:sz="0" w:space="0" w:color="FFFFFF"/>
-              <w:left w:val="nil" w:sz="0" w:space="0" w:color="FFFFFF"/>
-              <w:bottom w:val="single" w:sz="12" w:space="0" w:color="000000"/>
-              <w:right w:val="nil" w:sz="0" w:space="0" w:color="FFFFFF"/>
-            </w:tcBorders>
-          </w:tcPr>
-          <w:p>
-            <w:pPr>
-              <w:spacing w:after="0" w:before="0"/>
-              <w:jc w:val="center"/>
-            </w:pPr>
-            <w:r>
-              <w:rPr>
-                <w:rFonts w:ascii="Times New Roman" w:hAnsi="Times New Roman" w:eastAsia="SimSun"/>
-                <w:b w:val="0"/>
-                <w:i w:val="0"/>
-                <w:color w:val="000000"/>
-                <w:sz w:val="17"/>
-              </w:rPr>
-            </w:r>
-            <w:r>
-              <w:rPr>
-                <w:rFonts w:ascii="Times New Roman" w:hAnsi="Times New Roman" w:eastAsia="SimSun"/>
-                <w:b w:val="0"/>
-                <w:i w:val="0"/>
-                <w:color w:val="000000"/>
-                <w:sz w:val="17"/>
-              </w:rPr>
-              <w:t>Anaconda channel 新版条款需要确认</w:t>
-            </w:r>
-          </w:p>
-        </w:tc>
-        <w:tc>
-          <w:tcPr>
-            <w:tcW w:type="dxa" w:w="2266"/>
-            <w:vAlign w:val="center"/>
-            <w:tcMar>
-              <w:top w:w="60" w:type="dxa"/>
-              <w:start w:w="90" w:type="dxa"/>
-              <w:bottom w:w="60" w:type="dxa"/>
-              <w:end w:w="90" w:type="dxa"/>
-            </w:tcMar>
-            <w:tcBorders>
-              <w:top w:val="nil" w:sz="0" w:space="0" w:color="FFFFFF"/>
-              <w:left w:val="nil" w:sz="0" w:space="0" w:color="FFFFFF"/>
-              <w:bottom w:val="single" w:sz="12" w:space="0" w:color="000000"/>
-              <w:right w:val="nil" w:sz="0" w:space="0" w:color="FFFFFF"/>
-            </w:tcBorders>
-          </w:tcPr>
-          <w:p>
-            <w:pPr>
-              <w:spacing w:after="0" w:before="0"/>
-              <w:jc w:val="center"/>
-            </w:pPr>
-            <w:r>
-              <w:rPr>
-                <w:rFonts w:ascii="Times New Roman" w:hAnsi="Times New Roman" w:eastAsia="SimSun"/>
-                <w:b w:val="0"/>
-                <w:i w:val="0"/>
-                <w:color w:val="000000"/>
-                <w:sz w:val="17"/>
-              </w:rPr>
-            </w:r>
-            <w:r>
-              <w:rPr>
-                <w:rFonts w:ascii="Times New Roman" w:hAnsi="Times New Roman" w:eastAsia="SimSun"/>
-                <w:b w:val="0"/>
-                <w:i w:val="0"/>
-                <w:color w:val="000000"/>
-                <w:sz w:val="17"/>
-              </w:rPr>
-              <w:t>执行 conda tos accept ... 后创建环境</w:t>
-            </w:r>
-          </w:p>
-        </w:tc>
-      </w:tr>
-    </w:tbl>
-    <w:p>
-      <w:pPr>
-        <w:spacing w:after="80"/>
-      </w:pPr>
-    </w:p>
-    <w:p>
-      <w:pPr>
-        <w:spacing w:after="60"/>
-        <w:ind w:firstLine="420"/>
-      </w:pPr>
-      <w:r>
-        <w:rPr>
-          <w:rFonts w:ascii="Times New Roman" w:hAnsi="Times New Roman" w:eastAsia="SimSun"/>
-          <w:b w:val="0"/>
-          <w:i w:val="0"/>
-          <w:color w:val="000000"/>
-          <w:sz w:val="21"/>
-        </w:rPr>
-        <w:t>详细记录见：</w:t>
-      </w:r>
-    </w:p>
-    <w:p>
-      <w:pPr>
-        <w:spacing w:after="0"/>
-        <w:ind w:left="283"/>
-      </w:pPr>
-      <w:r>
-        <w:rPr>
-          <w:rFonts w:ascii="Consolas" w:hAnsi="Consolas" w:eastAsia="SimSun"/>
-          <w:b w:val="0"/>
-          <w:i w:val="0"/>
-          <w:color w:val="000000"/>
-          <w:sz w:val="18"/>
-        </w:rPr>
-        <w:t>docs/pitfalls.md</w:t>
       </w:r>
     </w:p>
     <w:p>
@@ -4242,7 +3493,7 @@
       </w:pPr>
       <w:r>
         <w:rPr>
-          <w:rFonts w:ascii="Consolas" w:hAnsi="Consolas" w:eastAsia="SimSun"/>
+          <w:rFonts w:ascii="Times New Roman" w:hAnsi="Times New Roman" w:eastAsia="SimSun"/>
           <w:b w:val="0"/>
           <w:i w:val="0"/>
           <w:color w:val="000000"/>
@@ -4274,7 +3525,7 @@
       </w:pPr>
       <w:r>
         <w:rPr>
-          <w:rFonts w:ascii="Consolas" w:hAnsi="Consolas" w:eastAsia="SimSun"/>
+          <w:rFonts w:ascii="Times New Roman" w:hAnsi="Times New Roman" w:eastAsia="SimSun"/>
           <w:b w:val="0"/>
           <w:i w:val="0"/>
           <w:color w:val="000000"/>
@@ -5068,7 +4319,7 @@
       </w:pPr>
       <w:r>
         <w:rPr>
-          <w:rFonts w:ascii="Consolas" w:hAnsi="Consolas" w:eastAsia="SimSun"/>
+          <w:rFonts w:ascii="Times New Roman" w:hAnsi="Times New Roman" w:eastAsia="SimSun"/>
           <w:b w:val="0"/>
           <w:i w:val="0"/>
           <w:color w:val="000000"/>
@@ -5100,7 +4351,7 @@
       </w:pPr>
       <w:r>
         <w:rPr>
-          <w:rFonts w:ascii="Consolas" w:hAnsi="Consolas" w:eastAsia="SimSun"/>
+          <w:rFonts w:ascii="Times New Roman" w:hAnsi="Times New Roman" w:eastAsia="SimSun"/>
           <w:b w:val="0"/>
           <w:i w:val="0"/>
           <w:color w:val="000000"/>
@@ -6373,7 +5624,7 @@
       </w:pPr>
       <w:r>
         <w:rPr>
-          <w:rFonts w:ascii="Consolas" w:hAnsi="Consolas" w:eastAsia="SimSun"/>
+          <w:rFonts w:ascii="Times New Roman" w:hAnsi="Times New Roman" w:eastAsia="SimSun"/>
           <w:b w:val="0"/>
           <w:i w:val="0"/>
           <w:color w:val="000000"/>
@@ -6389,7 +5640,7 @@
       </w:pPr>
       <w:r>
         <w:rPr>
-          <w:rFonts w:ascii="Consolas" w:hAnsi="Consolas" w:eastAsia="SimSun"/>
+          <w:rFonts w:ascii="Times New Roman" w:hAnsi="Times New Roman" w:eastAsia="SimSun"/>
           <w:b w:val="0"/>
           <w:i w:val="0"/>
           <w:color w:val="000000"/>
@@ -8798,7 +8049,7 @@
       </w:pPr>
       <w:r>
         <w:rPr>
-          <w:rFonts w:ascii="Consolas" w:hAnsi="Consolas" w:eastAsia="SimSun"/>
+          <w:rFonts w:ascii="Times New Roman" w:hAnsi="Times New Roman" w:eastAsia="SimSun"/>
           <w:b w:val="0"/>
           <w:i w:val="0"/>
           <w:color w:val="000000"/>
@@ -8814,7 +8065,7 @@
       </w:pPr>
       <w:r>
         <w:rPr>
-          <w:rFonts w:ascii="Consolas" w:hAnsi="Consolas" w:eastAsia="SimSun"/>
+          <w:rFonts w:ascii="Times New Roman" w:hAnsi="Times New Roman" w:eastAsia="SimSun"/>
           <w:b w:val="0"/>
           <w:i w:val="0"/>
           <w:color w:val="000000"/>
@@ -8830,7 +8081,7 @@
       </w:pPr>
       <w:r>
         <w:rPr>
-          <w:rFonts w:ascii="Consolas" w:hAnsi="Consolas" w:eastAsia="SimSun"/>
+          <w:rFonts w:ascii="Times New Roman" w:hAnsi="Times New Roman" w:eastAsia="SimSun"/>
           <w:b w:val="0"/>
           <w:i w:val="0"/>
           <w:color w:val="000000"/>
@@ -8846,7 +8097,7 @@
       </w:pPr>
       <w:r>
         <w:rPr>
-          <w:rFonts w:ascii="Consolas" w:hAnsi="Consolas" w:eastAsia="SimSun"/>
+          <w:rFonts w:ascii="Times New Roman" w:hAnsi="Times New Roman" w:eastAsia="SimSun"/>
           <w:b w:val="0"/>
           <w:i w:val="0"/>
           <w:color w:val="000000"/>
@@ -8909,7 +8160,7 @@
       </w:pPr>
       <w:r>
         <w:rPr>
-          <w:rFonts w:ascii="Consolas" w:hAnsi="Consolas" w:eastAsia="SimSun"/>
+          <w:rFonts w:ascii="Times New Roman" w:hAnsi="Times New Roman" w:eastAsia="SimSun"/>
           <w:b w:val="0"/>
           <w:i w:val="0"/>
           <w:color w:val="000000"/>
@@ -10494,7 +9745,7 @@
       </w:pPr>
       <w:r>
         <w:rPr>
-          <w:rFonts w:ascii="Consolas" w:hAnsi="Consolas" w:eastAsia="SimSun"/>
+          <w:rFonts w:ascii="Times New Roman" w:hAnsi="Times New Roman" w:eastAsia="SimSun"/>
           <w:b w:val="0"/>
           <w:i w:val="0"/>
           <w:color w:val="000000"/>
@@ -10510,7 +9761,7 @@
       </w:pPr>
       <w:r>
         <w:rPr>
-          <w:rFonts w:ascii="Consolas" w:hAnsi="Consolas" w:eastAsia="SimSun"/>
+          <w:rFonts w:ascii="Times New Roman" w:hAnsi="Times New Roman" w:eastAsia="SimSun"/>
           <w:b w:val="0"/>
           <w:i w:val="0"/>
           <w:color w:val="000000"/>
@@ -10526,7 +9777,7 @@
       </w:pPr>
       <w:r>
         <w:rPr>
-          <w:rFonts w:ascii="Consolas" w:hAnsi="Consolas" w:eastAsia="SimSun"/>
+          <w:rFonts w:ascii="Times New Roman" w:hAnsi="Times New Roman" w:eastAsia="SimSun"/>
           <w:b w:val="0"/>
           <w:i w:val="0"/>
           <w:color w:val="000000"/>
@@ -10542,7 +9793,7 @@
       </w:pPr>
       <w:r>
         <w:rPr>
-          <w:rFonts w:ascii="Consolas" w:hAnsi="Consolas" w:eastAsia="SimSun"/>
+          <w:rFonts w:ascii="Times New Roman" w:hAnsi="Times New Roman" w:eastAsia="SimSun"/>
           <w:b w:val="0"/>
           <w:i w:val="0"/>
           <w:color w:val="000000"/>

</xml_diff>